<commit_message>
docs: update project status for core completion
</commit_message>
<xml_diff>
--- a/docs/BaoCao_Suon_FashionStoreSystem.docx
+++ b/docs/BaoCao_Suon_FashionStoreSystem.docx
@@ -207,6 +207,77 @@
     <w:p>
       <w:r>
         <w:t xml:space="preserve">Có thể trình bày ngắn gọn rằng: đề tài này không chỉ làm một website bán hàng đơn giản, mà tập trung xây dựng lõi nghiệp vụ C++ OOP cho hệ thống bán hàng thời trang. Web là lớp hiển thị hỗ trợ, còn phần quan trọng nhất là cách các đối tượng như Product, Cart, Order, Voucher, Customer, Review và ReturnRequest phối hợp với nhau theo đúng quy tắc nghiệp vụ.</w:t>
+      </w:r>
+    </w:p>
+    <w:p>
+      <w:r>
+        <w:t xml:space="preserve"/>
+      </w:r>
+    </w:p>
+    <w:p>
+      <w:pPr>
+        <w:pStyle w:val="Heading1"/>
+      </w:pPr>
+      <w:r>
+        <w:t xml:space="preserve">CẬP NHẬT HOÀN THIỆN THEO 7 NHÓM CHỨC NĂNG</w:t>
+      </w:r>
+    </w:p>
+    <w:p>
+      <w:r>
+        <w:t xml:space="preserve">Sau giai đoạn hoàn thiện mới nhất, project đã bổ sung thêm các phần còn thiếu quan trọng để báo cáo có đủ nội dung về vận hành hệ thống, thanh toán, giao hàng, API và web integration.</w:t>
+      </w:r>
+    </w:p>
+    <w:p>
+      <w:r>
+        <w:t xml:space="preserve">• Nhóm 1 - Staff/Admin management: bổ sung service quản lý sản phẩm, biến thể, tồn kho, voucher, xem đơn hàng, hủy đơn và chuyển trạng thái đơn hàng. ListParagraph</w:t>
+      </w:r>
+    </w:p>
+    <w:p>
+      <w:r>
+        <w:t xml:space="preserve">• Nhóm 2 - Catalog search/filter/sort: bổ sung tìm kiếm sản phẩm theo keyword, category, size, color, khoảng giá, collection, status và sắp xếp theo tên hoặc giá. ListParagraph</w:t>
+      </w:r>
+    </w:p>
+    <w:p>
+      <w:r>
+        <w:t xml:space="preserve">• Nhóm 3 - Payment module: bổ sung mô hình Payment base class và các lớp CashPayment, BankTransferPayment, EWalletPayment để minh họa kế thừa và đa hình trong OOP. ListParagraph</w:t>
+      </w:r>
+    </w:p>
+    <w:p>
+      <w:r>
+        <w:t xml:space="preserve">• Nhóm 4 - Shipping module: bổ sung shipment, shipping method, quote phí giao hàng, tracking code và trạng thái giao hàng. ListParagraph</w:t>
+      </w:r>
+    </w:p>
+    <w:p>
+      <w:r>
+        <w:t xml:space="preserve">• Nhóm 5 - API facade: bổ sung lớp FashionStoreApi làm boundary cho backend/API adapter, hiện hỗ trợ sign-in, catalog search, add-to-cart và checkout. ListParagraph</w:t>
+      </w:r>
+    </w:p>
+    <w:p>
+      <w:r>
+        <w:t xml:space="preserve">• Nhóm 6 - Web API client: bổ sung api-client.js để web có thể gọi endpoint backend trong tương lai, đồng thời vẫn fallback về demo state khi API chưa chạy. ListParagraph</w:t>
+      </w:r>
+    </w:p>
+    <w:p>
+      <w:r>
+        <w:t xml:space="preserve">• Nhóm 7 - Docs/test: cập nhật README, architecture overview và bổ sung smoke tests cho các module mới. ListParagraph</w:t>
+      </w:r>
+    </w:p>
+    <w:p>
+      <w:pPr>
+        <w:pStyle w:val="Heading1"/>
+      </w:pPr>
+      <w:r>
+        <w:t xml:space="preserve">Tiến độ sau cập nhật</w:t>
+      </w:r>
+    </w:p>
+    <w:p>
+      <w:r>
+        <w:t xml:space="preserve">Nếu tính riêng core OOP C++, project hiện đạt khoảng 88-90%. Nếu tính toàn bộ hệ thống production-like gồm HTTP server thật, database thật và web kết nối backend đầy đủ, project đạt khoảng 75-78%.</w:t>
+      </w:r>
+    </w:p>
+    <w:p>
+      <w:r>
+        <w:t xml:space="preserve">Các phần còn lại để hoàn chỉnh hơn gồm: dựng HTTP server thật quanh API facade, nối web checkout/cart với response thật từ backend, thay file persistence bằng SQLite/database thật nếu cần, và bổ sung test sâu cho các edge case payment/shipping/admin.</w:t>
       </w:r>
     </w:p>
     <w:p>

</xml_diff>